<commit_message>
generacion de contrato de pre adopcion
</commit_message>
<xml_diff>
--- a/app/contracts/contrato_preadopcion.docx
+++ b/app/contracts/contrato_preadopcion.docx
@@ -1,6 +1,6 @@
 
 <file path=word/document.xml><?xml version="1.0" encoding="utf-8"?>
-<w:document xmlns:wpc="http://schemas.microsoft.com/office/word/2010/wordprocessingCanvas" xmlns:cx="http://schemas.microsoft.com/office/drawing/2014/chartex" xmlns:mc="http://schemas.openxmlformats.org/markup-compatibility/2006" xmlns:o="urn:schemas-microsoft-com:office:office" xmlns:r="http://schemas.openxmlformats.org/officeDocument/2006/relationships" xmlns:m="http://schemas.openxmlformats.org/officeDocument/2006/math" xmlns:v="urn:schemas-microsoft-com:vml" xmlns:wp14="http://schemas.microsoft.com/office/word/2010/wordprocessingDrawing" xmlns:wp="http://schemas.openxmlformats.org/drawingml/2006/wordprocessingDrawing" xmlns:w10="urn:schemas-microsoft-com:office:word" xmlns:w="http://schemas.openxmlformats.org/wordprocessingml/2006/main" xmlns:w14="http://schemas.microsoft.com/office/word/2010/wordml" xmlns:w15="http://schemas.microsoft.com/office/word/2012/wordml" xmlns:w16se="http://schemas.microsoft.com/office/word/2015/wordml/symex" xmlns:wpg="http://schemas.microsoft.com/office/word/2010/wordprocessingGroup" xmlns:wpi="http://schemas.microsoft.com/office/word/2010/wordprocessingInk" xmlns:wne="http://schemas.microsoft.com/office/word/2006/wordml" xmlns:wps="http://schemas.microsoft.com/office/word/2010/wordprocessingShape" mc:Ignorable="w14 w15 w16se wp14">
+<w:document xmlns:wpc="http://schemas.microsoft.com/office/word/2010/wordprocessingCanvas" xmlns:cx="http://schemas.microsoft.com/office/drawing/2014/chartex" xmlns:cx1="http://schemas.microsoft.com/office/drawing/2015/9/8/chartex" xmlns:cx2="http://schemas.microsoft.com/office/drawing/2015/10/21/chartex" xmlns:cx3="http://schemas.microsoft.com/office/drawing/2016/5/9/chartex" xmlns:cx4="http://schemas.microsoft.com/office/drawing/2016/5/10/chartex" xmlns:cx5="http://schemas.microsoft.com/office/drawing/2016/5/11/chartex" xmlns:cx6="http://schemas.microsoft.com/office/drawing/2016/5/12/chartex" xmlns:cx7="http://schemas.microsoft.com/office/drawing/2016/5/13/chartex" xmlns:cx8="http://schemas.microsoft.com/office/drawing/2016/5/14/chartex" xmlns:mc="http://schemas.openxmlformats.org/markup-compatibility/2006" xmlns:aink="http://schemas.microsoft.com/office/drawing/2016/ink" xmlns:am3d="http://schemas.microsoft.com/office/drawing/2017/model3d" xmlns:o="urn:schemas-microsoft-com:office:office" xmlns:oel="http://schemas.microsoft.com/office/2019/extlst" xmlns:r="http://schemas.openxmlformats.org/officeDocument/2006/relationships" xmlns:m="http://schemas.openxmlformats.org/officeDocument/2006/math" xmlns:v="urn:schemas-microsoft-com:vml" xmlns:wp14="http://schemas.microsoft.com/office/word/2010/wordprocessingDrawing" xmlns:wp="http://schemas.openxmlformats.org/drawingml/2006/wordprocessingDrawing" xmlns:w10="urn:schemas-microsoft-com:office:word" xmlns:w="http://schemas.openxmlformats.org/wordprocessingml/2006/main" xmlns:w14="http://schemas.microsoft.com/office/word/2010/wordml" xmlns:w15="http://schemas.microsoft.com/office/word/2012/wordml" xmlns:w16cex="http://schemas.microsoft.com/office/word/2018/wordml/cex" xmlns:w16cid="http://schemas.microsoft.com/office/word/2016/wordml/cid" xmlns:w16="http://schemas.microsoft.com/office/word/2018/wordml" xmlns:w16sdtdh="http://schemas.microsoft.com/office/word/2020/wordml/sdtdatahash" xmlns:w16se="http://schemas.microsoft.com/office/word/2015/wordml/symex" xmlns:wpg="http://schemas.microsoft.com/office/word/2010/wordprocessingGroup" xmlns:wpi="http://schemas.microsoft.com/office/word/2010/wordprocessingInk" xmlns:wne="http://schemas.microsoft.com/office/word/2006/wordml" xmlns:wps="http://schemas.microsoft.com/office/word/2010/wordprocessingShape" mc:Ignorable="w14 w15 w16se w16cid w16 w16cex w16sdtdh wp14">
   <w:body>
     <w:p>
       <w:pPr>
@@ -2608,8 +2608,6 @@
         </w:rPr>
         <w:t xml:space="preserve"> de 2026</w:t>
       </w:r>
-      <w:bookmarkStart w:id="0" w:name="_GoBack"/>
-      <w:bookmarkEnd w:id="0"/>
       <w:r>
         <w:rPr>
           <w:rFonts w:ascii="Times New Roman" w:eastAsia="Times New Roman" w:hAnsi="Times New Roman" w:cs="Times New Roman"/>
@@ -2638,7 +2636,7 @@
           <w:lang w:val="es-ES"/>
         </w:rPr>
         <w:drawing>
-          <wp:anchor distT="0" distB="0" distL="114300" distR="114300" simplePos="0" relativeHeight="251658240" behindDoc="1" locked="0" layoutInCell="1" allowOverlap="1" wp14:anchorId="00A98C47" wp14:editId="0377227D">
+          <wp:anchor distT="0" distB="0" distL="114300" distR="114300" simplePos="0" relativeHeight="251658240" behindDoc="1" locked="0" layoutInCell="1" allowOverlap="1" wp14:anchorId="24B4F922" wp14:editId="4DC6646B">
             <wp:simplePos x="0" y="0"/>
             <wp:positionH relativeFrom="column">
               <wp:posOffset>-295275</wp:posOffset>
@@ -2731,6 +2729,41 @@
         </w:rPr>
         <w:tab/>
       </w:r>
+    </w:p>
+    <w:p>
+      <w:pPr>
+        <w:rPr>
+          <w:rFonts w:ascii="Times New Roman" w:eastAsia="Times New Roman" w:hAnsi="Times New Roman" w:cs="Times New Roman"/>
+        </w:rPr>
+      </w:pPr>
+    </w:p>
+    <w:p>
+      <w:pPr>
+        <w:rPr>
+          <w:rFonts w:ascii="Times New Roman" w:eastAsia="Times New Roman" w:hAnsi="Times New Roman" w:cs="Times New Roman"/>
+        </w:rPr>
+      </w:pPr>
+    </w:p>
+    <w:p>
+      <w:pPr>
+        <w:rPr>
+          <w:rFonts w:ascii="Times New Roman" w:eastAsia="Times New Roman" w:hAnsi="Times New Roman" w:cs="Times New Roman"/>
+        </w:rPr>
+      </w:pPr>
+    </w:p>
+    <w:p>
+      <w:pPr>
+        <w:rPr>
+          <w:rFonts w:ascii="Times New Roman" w:eastAsia="Times New Roman" w:hAnsi="Times New Roman" w:cs="Times New Roman"/>
+        </w:rPr>
+      </w:pPr>
+    </w:p>
+    <w:p>
+      <w:pPr>
+        <w:rPr>
+          <w:rFonts w:ascii="Times New Roman" w:eastAsia="Times New Roman" w:hAnsi="Times New Roman" w:cs="Times New Roman"/>
+        </w:rPr>
+      </w:pPr>
       <w:r>
         <w:rPr>
           <w:rFonts w:ascii="Times New Roman" w:eastAsia="Times New Roman" w:hAnsi="Times New Roman" w:cs="Times New Roman"/>
@@ -2741,45 +2774,27 @@
         <w:rPr>
           <w:rFonts w:ascii="Times New Roman" w:eastAsia="Times New Roman" w:hAnsi="Times New Roman" w:cs="Times New Roman"/>
         </w:rPr>
-        <w:t>Persona que preadopta al animal</w:t>
-      </w:r>
-    </w:p>
-    <w:p>
-      <w:pPr>
-        <w:rPr>
-          <w:rFonts w:ascii="Times New Roman" w:eastAsia="Times New Roman" w:hAnsi="Times New Roman" w:cs="Times New Roman"/>
-        </w:rPr>
-      </w:pPr>
-    </w:p>
-    <w:p>
-      <w:pPr>
-        <w:rPr>
-          <w:rFonts w:ascii="Times New Roman" w:eastAsia="Times New Roman" w:hAnsi="Times New Roman" w:cs="Times New Roman"/>
-        </w:rPr>
-      </w:pPr>
-    </w:p>
-    <w:p>
-      <w:pPr>
-        <w:rPr>
-          <w:rFonts w:ascii="Times New Roman" w:eastAsia="Times New Roman" w:hAnsi="Times New Roman" w:cs="Times New Roman"/>
-        </w:rPr>
-      </w:pPr>
-    </w:p>
-    <w:p>
-      <w:pPr>
-        <w:rPr>
-          <w:rFonts w:ascii="Times New Roman" w:eastAsia="Times New Roman" w:hAnsi="Times New Roman" w:cs="Times New Roman"/>
-        </w:rPr>
-      </w:pPr>
-    </w:p>
-    <w:p>
-      <w:pPr>
-        <w:rPr>
-          <w:rFonts w:ascii="Times New Roman" w:eastAsia="Times New Roman" w:hAnsi="Times New Roman" w:cs="Times New Roman"/>
-          <w:b/>
-          <w:i/>
-          <w:sz w:val="20"/>
-          <w:szCs w:val="20"/>
+        <w:t xml:space="preserve">Persona que </w:t>
+      </w:r>
+      <w:proofErr w:type="spellStart"/>
+      <w:r>
+        <w:rPr>
+          <w:rFonts w:ascii="Times New Roman" w:eastAsia="Times New Roman" w:hAnsi="Times New Roman" w:cs="Times New Roman"/>
+        </w:rPr>
+        <w:t>preadopta</w:t>
+      </w:r>
+      <w:proofErr w:type="spellEnd"/>
+      <w:r>
+        <w:rPr>
+          <w:rFonts w:ascii="Times New Roman" w:eastAsia="Times New Roman" w:hAnsi="Times New Roman" w:cs="Times New Roman"/>
+        </w:rPr>
+        <w:t xml:space="preserve"> al animal</w:t>
+      </w:r>
+    </w:p>
+    <w:p>
+      <w:pPr>
+        <w:rPr>
+          <w:rFonts w:ascii="Times New Roman" w:eastAsia="Times New Roman" w:hAnsi="Times New Roman" w:cs="Times New Roman"/>
         </w:rPr>
       </w:pPr>
     </w:p>
@@ -2848,7 +2863,7 @@
 </file>
 
 <file path=word/endnotes.xml><?xml version="1.0" encoding="utf-8"?>
-<w:endnotes xmlns:wpc="http://schemas.microsoft.com/office/word/2010/wordprocessingCanvas" xmlns:cx="http://schemas.microsoft.com/office/drawing/2014/chartex" xmlns:mc="http://schemas.openxmlformats.org/markup-compatibility/2006" xmlns:o="urn:schemas-microsoft-com:office:office" xmlns:r="http://schemas.openxmlformats.org/officeDocument/2006/relationships" xmlns:m="http://schemas.openxmlformats.org/officeDocument/2006/math" xmlns:v="urn:schemas-microsoft-com:vml" xmlns:wp14="http://schemas.microsoft.com/office/word/2010/wordprocessingDrawing" xmlns:wp="http://schemas.openxmlformats.org/drawingml/2006/wordprocessingDrawing" xmlns:w10="urn:schemas-microsoft-com:office:word" xmlns:w="http://schemas.openxmlformats.org/wordprocessingml/2006/main" xmlns:w14="http://schemas.microsoft.com/office/word/2010/wordml" xmlns:w15="http://schemas.microsoft.com/office/word/2012/wordml" xmlns:w16se="http://schemas.microsoft.com/office/word/2015/wordml/symex" xmlns:wpg="http://schemas.microsoft.com/office/word/2010/wordprocessingGroup" xmlns:wpi="http://schemas.microsoft.com/office/word/2010/wordprocessingInk" xmlns:wne="http://schemas.microsoft.com/office/word/2006/wordml" xmlns:wps="http://schemas.microsoft.com/office/word/2010/wordprocessingShape" mc:Ignorable="w14 w15 w16se wp14">
+<w:endnotes xmlns:wpc="http://schemas.microsoft.com/office/word/2010/wordprocessingCanvas" xmlns:cx="http://schemas.microsoft.com/office/drawing/2014/chartex" xmlns:cx1="http://schemas.microsoft.com/office/drawing/2015/9/8/chartex" xmlns:cx2="http://schemas.microsoft.com/office/drawing/2015/10/21/chartex" xmlns:cx3="http://schemas.microsoft.com/office/drawing/2016/5/9/chartex" xmlns:cx4="http://schemas.microsoft.com/office/drawing/2016/5/10/chartex" xmlns:cx5="http://schemas.microsoft.com/office/drawing/2016/5/11/chartex" xmlns:cx6="http://schemas.microsoft.com/office/drawing/2016/5/12/chartex" xmlns:cx7="http://schemas.microsoft.com/office/drawing/2016/5/13/chartex" xmlns:cx8="http://schemas.microsoft.com/office/drawing/2016/5/14/chartex" xmlns:mc="http://schemas.openxmlformats.org/markup-compatibility/2006" xmlns:aink="http://schemas.microsoft.com/office/drawing/2016/ink" xmlns:am3d="http://schemas.microsoft.com/office/drawing/2017/model3d" xmlns:o="urn:schemas-microsoft-com:office:office" xmlns:oel="http://schemas.microsoft.com/office/2019/extlst" xmlns:r="http://schemas.openxmlformats.org/officeDocument/2006/relationships" xmlns:m="http://schemas.openxmlformats.org/officeDocument/2006/math" xmlns:v="urn:schemas-microsoft-com:vml" xmlns:wp14="http://schemas.microsoft.com/office/word/2010/wordprocessingDrawing" xmlns:wp="http://schemas.openxmlformats.org/drawingml/2006/wordprocessingDrawing" xmlns:w10="urn:schemas-microsoft-com:office:word" xmlns:w="http://schemas.openxmlformats.org/wordprocessingml/2006/main" xmlns:w14="http://schemas.microsoft.com/office/word/2010/wordml" xmlns:w15="http://schemas.microsoft.com/office/word/2012/wordml" xmlns:w16cex="http://schemas.microsoft.com/office/word/2018/wordml/cex" xmlns:w16cid="http://schemas.microsoft.com/office/word/2016/wordml/cid" xmlns:w16="http://schemas.microsoft.com/office/word/2018/wordml" xmlns:w16sdtdh="http://schemas.microsoft.com/office/word/2020/wordml/sdtdatahash" xmlns:w16se="http://schemas.microsoft.com/office/word/2015/wordml/symex" xmlns:wpg="http://schemas.microsoft.com/office/word/2010/wordprocessingGroup" xmlns:wpi="http://schemas.microsoft.com/office/word/2010/wordprocessingInk" xmlns:wne="http://schemas.microsoft.com/office/word/2006/wordml" xmlns:wps="http://schemas.microsoft.com/office/word/2010/wordprocessingShape" mc:Ignorable="w14 w15 w16se w16cid w16 w16cex w16sdtdh wp14">
   <w:endnote w:type="separator" w:id="-1">
     <w:p>
       <w:pPr>
@@ -2873,7 +2888,7 @@
 </file>
 
 <file path=word/footer1.xml><?xml version="1.0" encoding="utf-8"?>
-<w:ftr xmlns:wpc="http://schemas.microsoft.com/office/word/2010/wordprocessingCanvas" xmlns:cx="http://schemas.microsoft.com/office/drawing/2014/chartex" xmlns:mc="http://schemas.openxmlformats.org/markup-compatibility/2006" xmlns:o="urn:schemas-microsoft-com:office:office" xmlns:r="http://schemas.openxmlformats.org/officeDocument/2006/relationships" xmlns:m="http://schemas.openxmlformats.org/officeDocument/2006/math" xmlns:v="urn:schemas-microsoft-com:vml" xmlns:wp14="http://schemas.microsoft.com/office/word/2010/wordprocessingDrawing" xmlns:wp="http://schemas.openxmlformats.org/drawingml/2006/wordprocessingDrawing" xmlns:w10="urn:schemas-microsoft-com:office:word" xmlns:w="http://schemas.openxmlformats.org/wordprocessingml/2006/main" xmlns:w14="http://schemas.microsoft.com/office/word/2010/wordml" xmlns:w15="http://schemas.microsoft.com/office/word/2012/wordml" xmlns:w16se="http://schemas.microsoft.com/office/word/2015/wordml/symex" xmlns:wpg="http://schemas.microsoft.com/office/word/2010/wordprocessingGroup" xmlns:wpi="http://schemas.microsoft.com/office/word/2010/wordprocessingInk" xmlns:wne="http://schemas.microsoft.com/office/word/2006/wordml" xmlns:wps="http://schemas.microsoft.com/office/word/2010/wordprocessingShape" mc:Ignorable="w14 w15 w16se wp14">
+<w:ftr xmlns:wpc="http://schemas.microsoft.com/office/word/2010/wordprocessingCanvas" xmlns:cx="http://schemas.microsoft.com/office/drawing/2014/chartex" xmlns:cx1="http://schemas.microsoft.com/office/drawing/2015/9/8/chartex" xmlns:cx2="http://schemas.microsoft.com/office/drawing/2015/10/21/chartex" xmlns:cx3="http://schemas.microsoft.com/office/drawing/2016/5/9/chartex" xmlns:cx4="http://schemas.microsoft.com/office/drawing/2016/5/10/chartex" xmlns:cx5="http://schemas.microsoft.com/office/drawing/2016/5/11/chartex" xmlns:cx6="http://schemas.microsoft.com/office/drawing/2016/5/12/chartex" xmlns:cx7="http://schemas.microsoft.com/office/drawing/2016/5/13/chartex" xmlns:cx8="http://schemas.microsoft.com/office/drawing/2016/5/14/chartex" xmlns:mc="http://schemas.openxmlformats.org/markup-compatibility/2006" xmlns:aink="http://schemas.microsoft.com/office/drawing/2016/ink" xmlns:am3d="http://schemas.microsoft.com/office/drawing/2017/model3d" xmlns:o="urn:schemas-microsoft-com:office:office" xmlns:oel="http://schemas.microsoft.com/office/2019/extlst" xmlns:r="http://schemas.openxmlformats.org/officeDocument/2006/relationships" xmlns:m="http://schemas.openxmlformats.org/officeDocument/2006/math" xmlns:v="urn:schemas-microsoft-com:vml" xmlns:wp14="http://schemas.microsoft.com/office/word/2010/wordprocessingDrawing" xmlns:wp="http://schemas.openxmlformats.org/drawingml/2006/wordprocessingDrawing" xmlns:w10="urn:schemas-microsoft-com:office:word" xmlns:w="http://schemas.openxmlformats.org/wordprocessingml/2006/main" xmlns:w14="http://schemas.microsoft.com/office/word/2010/wordml" xmlns:w15="http://schemas.microsoft.com/office/word/2012/wordml" xmlns:w16cex="http://schemas.microsoft.com/office/word/2018/wordml/cex" xmlns:w16cid="http://schemas.microsoft.com/office/word/2016/wordml/cid" xmlns:w16="http://schemas.microsoft.com/office/word/2018/wordml" xmlns:w16sdtdh="http://schemas.microsoft.com/office/word/2020/wordml/sdtdatahash" xmlns:w16se="http://schemas.microsoft.com/office/word/2015/wordml/symex" xmlns:wpg="http://schemas.microsoft.com/office/word/2010/wordprocessingGroup" xmlns:wpi="http://schemas.microsoft.com/office/word/2010/wordprocessingInk" xmlns:wne="http://schemas.microsoft.com/office/word/2006/wordml" xmlns:wps="http://schemas.microsoft.com/office/word/2010/wordprocessingShape" mc:Ignorable="w14 w15 w16se w16cid w16 w16cex w16sdtdh wp14">
   <w:p>
     <w:pPr>
       <w:jc w:val="right"/>
@@ -2901,7 +2916,7 @@
 </file>
 
 <file path=word/footnotes.xml><?xml version="1.0" encoding="utf-8"?>
-<w:footnotes xmlns:wpc="http://schemas.microsoft.com/office/word/2010/wordprocessingCanvas" xmlns:cx="http://schemas.microsoft.com/office/drawing/2014/chartex" xmlns:mc="http://schemas.openxmlformats.org/markup-compatibility/2006" xmlns:o="urn:schemas-microsoft-com:office:office" xmlns:r="http://schemas.openxmlformats.org/officeDocument/2006/relationships" xmlns:m="http://schemas.openxmlformats.org/officeDocument/2006/math" xmlns:v="urn:schemas-microsoft-com:vml" xmlns:wp14="http://schemas.microsoft.com/office/word/2010/wordprocessingDrawing" xmlns:wp="http://schemas.openxmlformats.org/drawingml/2006/wordprocessingDrawing" xmlns:w10="urn:schemas-microsoft-com:office:word" xmlns:w="http://schemas.openxmlformats.org/wordprocessingml/2006/main" xmlns:w14="http://schemas.microsoft.com/office/word/2010/wordml" xmlns:w15="http://schemas.microsoft.com/office/word/2012/wordml" xmlns:w16se="http://schemas.microsoft.com/office/word/2015/wordml/symex" xmlns:wpg="http://schemas.microsoft.com/office/word/2010/wordprocessingGroup" xmlns:wpi="http://schemas.microsoft.com/office/word/2010/wordprocessingInk" xmlns:wne="http://schemas.microsoft.com/office/word/2006/wordml" xmlns:wps="http://schemas.microsoft.com/office/word/2010/wordprocessingShape" mc:Ignorable="w14 w15 w16se wp14">
+<w:footnotes xmlns:wpc="http://schemas.microsoft.com/office/word/2010/wordprocessingCanvas" xmlns:cx="http://schemas.microsoft.com/office/drawing/2014/chartex" xmlns:cx1="http://schemas.microsoft.com/office/drawing/2015/9/8/chartex" xmlns:cx2="http://schemas.microsoft.com/office/drawing/2015/10/21/chartex" xmlns:cx3="http://schemas.microsoft.com/office/drawing/2016/5/9/chartex" xmlns:cx4="http://schemas.microsoft.com/office/drawing/2016/5/10/chartex" xmlns:cx5="http://schemas.microsoft.com/office/drawing/2016/5/11/chartex" xmlns:cx6="http://schemas.microsoft.com/office/drawing/2016/5/12/chartex" xmlns:cx7="http://schemas.microsoft.com/office/drawing/2016/5/13/chartex" xmlns:cx8="http://schemas.microsoft.com/office/drawing/2016/5/14/chartex" xmlns:mc="http://schemas.openxmlformats.org/markup-compatibility/2006" xmlns:aink="http://schemas.microsoft.com/office/drawing/2016/ink" xmlns:am3d="http://schemas.microsoft.com/office/drawing/2017/model3d" xmlns:o="urn:schemas-microsoft-com:office:office" xmlns:oel="http://schemas.microsoft.com/office/2019/extlst" xmlns:r="http://schemas.openxmlformats.org/officeDocument/2006/relationships" xmlns:m="http://schemas.openxmlformats.org/officeDocument/2006/math" xmlns:v="urn:schemas-microsoft-com:vml" xmlns:wp14="http://schemas.microsoft.com/office/word/2010/wordprocessingDrawing" xmlns:wp="http://schemas.openxmlformats.org/drawingml/2006/wordprocessingDrawing" xmlns:w10="urn:schemas-microsoft-com:office:word" xmlns:w="http://schemas.openxmlformats.org/wordprocessingml/2006/main" xmlns:w14="http://schemas.microsoft.com/office/word/2010/wordml" xmlns:w15="http://schemas.microsoft.com/office/word/2012/wordml" xmlns:w16cex="http://schemas.microsoft.com/office/word/2018/wordml/cex" xmlns:w16cid="http://schemas.microsoft.com/office/word/2016/wordml/cid" xmlns:w16="http://schemas.microsoft.com/office/word/2018/wordml" xmlns:w16sdtdh="http://schemas.microsoft.com/office/word/2020/wordml/sdtdatahash" xmlns:w16se="http://schemas.microsoft.com/office/word/2015/wordml/symex" xmlns:wpg="http://schemas.microsoft.com/office/word/2010/wordprocessingGroup" xmlns:wpi="http://schemas.microsoft.com/office/word/2010/wordprocessingInk" xmlns:wne="http://schemas.microsoft.com/office/word/2006/wordml" xmlns:wps="http://schemas.microsoft.com/office/word/2010/wordprocessingShape" mc:Ignorable="w14 w15 w16se w16cid w16 w16cex w16sdtdh wp14">
   <w:footnote w:type="separator" w:id="-1">
     <w:p>
       <w:pPr>
@@ -2926,7 +2941,7 @@
 </file>
 
 <file path=word/header1.xml><?xml version="1.0" encoding="utf-8"?>
-<w:hdr xmlns:wpc="http://schemas.microsoft.com/office/word/2010/wordprocessingCanvas" xmlns:cx="http://schemas.microsoft.com/office/drawing/2014/chartex" xmlns:mc="http://schemas.openxmlformats.org/markup-compatibility/2006" xmlns:o="urn:schemas-microsoft-com:office:office" xmlns:r="http://schemas.openxmlformats.org/officeDocument/2006/relationships" xmlns:m="http://schemas.openxmlformats.org/officeDocument/2006/math" xmlns:v="urn:schemas-microsoft-com:vml" xmlns:wp14="http://schemas.microsoft.com/office/word/2010/wordprocessingDrawing" xmlns:wp="http://schemas.openxmlformats.org/drawingml/2006/wordprocessingDrawing" xmlns:w10="urn:schemas-microsoft-com:office:word" xmlns:w="http://schemas.openxmlformats.org/wordprocessingml/2006/main" xmlns:w14="http://schemas.microsoft.com/office/word/2010/wordml" xmlns:w15="http://schemas.microsoft.com/office/word/2012/wordml" xmlns:w16se="http://schemas.microsoft.com/office/word/2015/wordml/symex" xmlns:wpg="http://schemas.microsoft.com/office/word/2010/wordprocessingGroup" xmlns:wpi="http://schemas.microsoft.com/office/word/2010/wordprocessingInk" xmlns:wne="http://schemas.microsoft.com/office/word/2006/wordml" xmlns:wps="http://schemas.microsoft.com/office/word/2010/wordprocessingShape" mc:Ignorable="w14 w15 w16se wp14">
+<w:hdr xmlns:wpc="http://schemas.microsoft.com/office/word/2010/wordprocessingCanvas" xmlns:cx="http://schemas.microsoft.com/office/drawing/2014/chartex" xmlns:cx1="http://schemas.microsoft.com/office/drawing/2015/9/8/chartex" xmlns:cx2="http://schemas.microsoft.com/office/drawing/2015/10/21/chartex" xmlns:cx3="http://schemas.microsoft.com/office/drawing/2016/5/9/chartex" xmlns:cx4="http://schemas.microsoft.com/office/drawing/2016/5/10/chartex" xmlns:cx5="http://schemas.microsoft.com/office/drawing/2016/5/11/chartex" xmlns:cx6="http://schemas.microsoft.com/office/drawing/2016/5/12/chartex" xmlns:cx7="http://schemas.microsoft.com/office/drawing/2016/5/13/chartex" xmlns:cx8="http://schemas.microsoft.com/office/drawing/2016/5/14/chartex" xmlns:mc="http://schemas.openxmlformats.org/markup-compatibility/2006" xmlns:aink="http://schemas.microsoft.com/office/drawing/2016/ink" xmlns:am3d="http://schemas.microsoft.com/office/drawing/2017/model3d" xmlns:o="urn:schemas-microsoft-com:office:office" xmlns:oel="http://schemas.microsoft.com/office/2019/extlst" xmlns:r="http://schemas.openxmlformats.org/officeDocument/2006/relationships" xmlns:m="http://schemas.openxmlformats.org/officeDocument/2006/math" xmlns:v="urn:schemas-microsoft-com:vml" xmlns:wp14="http://schemas.microsoft.com/office/word/2010/wordprocessingDrawing" xmlns:wp="http://schemas.openxmlformats.org/drawingml/2006/wordprocessingDrawing" xmlns:w10="urn:schemas-microsoft-com:office:word" xmlns:w="http://schemas.openxmlformats.org/wordprocessingml/2006/main" xmlns:w14="http://schemas.microsoft.com/office/word/2010/wordml" xmlns:w15="http://schemas.microsoft.com/office/word/2012/wordml" xmlns:w16cex="http://schemas.microsoft.com/office/word/2018/wordml/cex" xmlns:w16cid="http://schemas.microsoft.com/office/word/2016/wordml/cid" xmlns:w16="http://schemas.microsoft.com/office/word/2018/wordml" xmlns:w16sdtdh="http://schemas.microsoft.com/office/word/2020/wordml/sdtdatahash" xmlns:w16se="http://schemas.microsoft.com/office/word/2015/wordml/symex" xmlns:wpg="http://schemas.microsoft.com/office/word/2010/wordprocessingGroup" xmlns:wpi="http://schemas.microsoft.com/office/word/2010/wordprocessingInk" xmlns:wne="http://schemas.microsoft.com/office/word/2006/wordml" xmlns:wps="http://schemas.microsoft.com/office/word/2010/wordprocessingShape" mc:Ignorable="w14 w15 w16se w16cid w16 w16cex w16sdtdh wp14">
   <w:p>
     <w:pPr>
       <w:jc w:val="center"/>
@@ -2980,7 +2995,7 @@
         <w:lang w:val="es-ES"/>
       </w:rPr>
       <w:drawing>
-        <wp:anchor distT="114300" distB="114300" distL="114300" distR="114300" simplePos="0" relativeHeight="251657216" behindDoc="1" locked="0" layoutInCell="1" hidden="0" allowOverlap="1">
+        <wp:anchor distT="114300" distB="114300" distL="114300" distR="114300" simplePos="0" relativeHeight="251657216" behindDoc="1" locked="0" layoutInCell="1" hidden="0" allowOverlap="1" wp14:anchorId="7EC3EE71" wp14:editId="3D9F5931">
           <wp:simplePos x="0" y="0"/>
           <wp:positionH relativeFrom="column">
             <wp:posOffset>5143500</wp:posOffset>
@@ -3109,7 +3124,7 @@
         <w:sz w:val="28"/>
         <w:szCs w:val="28"/>
       </w:rPr>
-      <w:pict>
+      <w:pict w14:anchorId="252D7542">
         <v:shapetype id="_x0000_t75" coordsize="21600,21600" o:spt="75" o:preferrelative="t" path="m@4@5l@4@11@9@11@9@5xe" filled="f" stroked="f">
           <v:stroke joinstyle="miter"/>
           <v:formulas>
@@ -3129,7 +3144,7 @@
           <v:path o:extrusionok="f" gradientshapeok="t" o:connecttype="rect"/>
           <o:lock v:ext="edit" aspectratio="t"/>
         </v:shapetype>
-        <v:shape id="WordPictureWatermark1" o:spid="_x0000_s2049" type="#_x0000_t75" alt="" style="position:absolute;left:0;text-align:left;margin-left:0;margin-top:0;width:902.55pt;height:661.8pt;z-index:-251658240;mso-position-horizontal:center;mso-position-horizontal-relative:margin;mso-position-vertical:center;mso-position-vertical-relative:margin">
+        <v:shape id="WordPictureWatermark1" o:spid="_x0000_s1025" type="#_x0000_t75" alt="" style="position:absolute;left:0;text-align:left;margin-left:0;margin-top:0;width:902.55pt;height:661.8pt;z-index:-251658240;mso-position-horizontal:center;mso-position-horizontal-relative:margin;mso-position-vertical:center;mso-position-vertical-relative:margin">
           <v:imagedata r:id="rId2" o:title="image3" gain="19661f" blacklevel="22938f"/>
           <w10:wrap anchorx="margin" anchory="margin"/>
         </v:shape>
@@ -3179,7 +3194,7 @@
 </file>
 
 <file path=word/numbering.xml><?xml version="1.0" encoding="utf-8"?>
-<w:numbering xmlns:wpc="http://schemas.microsoft.com/office/word/2010/wordprocessingCanvas" xmlns:cx="http://schemas.microsoft.com/office/drawing/2014/chartex" xmlns:mc="http://schemas.openxmlformats.org/markup-compatibility/2006" xmlns:o="urn:schemas-microsoft-com:office:office" xmlns:r="http://schemas.openxmlformats.org/officeDocument/2006/relationships" xmlns:m="http://schemas.openxmlformats.org/officeDocument/2006/math" xmlns:v="urn:schemas-microsoft-com:vml" xmlns:wp14="http://schemas.microsoft.com/office/word/2010/wordprocessingDrawing" xmlns:wp="http://schemas.openxmlformats.org/drawingml/2006/wordprocessingDrawing" xmlns:w10="urn:schemas-microsoft-com:office:word" xmlns:w="http://schemas.openxmlformats.org/wordprocessingml/2006/main" xmlns:w14="http://schemas.microsoft.com/office/word/2010/wordml" xmlns:w15="http://schemas.microsoft.com/office/word/2012/wordml" xmlns:w16se="http://schemas.microsoft.com/office/word/2015/wordml/symex" xmlns:wpg="http://schemas.microsoft.com/office/word/2010/wordprocessingGroup" xmlns:wpi="http://schemas.microsoft.com/office/word/2010/wordprocessingInk" xmlns:wne="http://schemas.microsoft.com/office/word/2006/wordml" xmlns:wps="http://schemas.microsoft.com/office/word/2010/wordprocessingShape" mc:Ignorable="w14 w15 w16se wp14">
+<w:numbering xmlns:wpc="http://schemas.microsoft.com/office/word/2010/wordprocessingCanvas" xmlns:cx="http://schemas.microsoft.com/office/drawing/2014/chartex" xmlns:cx1="http://schemas.microsoft.com/office/drawing/2015/9/8/chartex" xmlns:cx2="http://schemas.microsoft.com/office/drawing/2015/10/21/chartex" xmlns:cx3="http://schemas.microsoft.com/office/drawing/2016/5/9/chartex" xmlns:cx4="http://schemas.microsoft.com/office/drawing/2016/5/10/chartex" xmlns:cx5="http://schemas.microsoft.com/office/drawing/2016/5/11/chartex" xmlns:cx6="http://schemas.microsoft.com/office/drawing/2016/5/12/chartex" xmlns:cx7="http://schemas.microsoft.com/office/drawing/2016/5/13/chartex" xmlns:cx8="http://schemas.microsoft.com/office/drawing/2016/5/14/chartex" xmlns:mc="http://schemas.openxmlformats.org/markup-compatibility/2006" xmlns:aink="http://schemas.microsoft.com/office/drawing/2016/ink" xmlns:am3d="http://schemas.microsoft.com/office/drawing/2017/model3d" xmlns:o="urn:schemas-microsoft-com:office:office" xmlns:oel="http://schemas.microsoft.com/office/2019/extlst" xmlns:r="http://schemas.openxmlformats.org/officeDocument/2006/relationships" xmlns:m="http://schemas.openxmlformats.org/officeDocument/2006/math" xmlns:v="urn:schemas-microsoft-com:vml" xmlns:wp14="http://schemas.microsoft.com/office/word/2010/wordprocessingDrawing" xmlns:wp="http://schemas.openxmlformats.org/drawingml/2006/wordprocessingDrawing" xmlns:w10="urn:schemas-microsoft-com:office:word" xmlns:w="http://schemas.openxmlformats.org/wordprocessingml/2006/main" xmlns:w14="http://schemas.microsoft.com/office/word/2010/wordml" xmlns:w15="http://schemas.microsoft.com/office/word/2012/wordml" xmlns:w16cex="http://schemas.microsoft.com/office/word/2018/wordml/cex" xmlns:w16cid="http://schemas.microsoft.com/office/word/2016/wordml/cid" xmlns:w16="http://schemas.microsoft.com/office/word/2018/wordml" xmlns:w16sdtdh="http://schemas.microsoft.com/office/word/2020/wordml/sdtdatahash" xmlns:w16se="http://schemas.microsoft.com/office/word/2015/wordml/symex" xmlns:wpg="http://schemas.microsoft.com/office/word/2010/wordprocessingGroup" xmlns:wpi="http://schemas.microsoft.com/office/word/2010/wordprocessingInk" xmlns:wne="http://schemas.microsoft.com/office/word/2006/wordml" xmlns:wps="http://schemas.microsoft.com/office/word/2010/wordprocessingShape" mc:Ignorable="w14 w15 w16se w16cid w16 w16cex w16sdtdh wp14">
   <w:abstractNum w:abstractNumId="0" w15:restartNumberingAfterBreak="0">
     <w:nsid w:val="296E1E96"/>
     <w:multiLevelType w:val="multilevel"/>
@@ -3406,17 +3421,17 @@
       </w:rPr>
     </w:lvl>
   </w:abstractNum>
-  <w:num w:numId="1">
+  <w:num w:numId="1" w16cid:durableId="152264764">
     <w:abstractNumId w:val="0"/>
   </w:num>
-  <w:num w:numId="2">
+  <w:num w:numId="2" w16cid:durableId="1656571953">
     <w:abstractNumId w:val="1"/>
   </w:num>
 </w:numbering>
 </file>
 
 <file path=word/styles.xml><?xml version="1.0" encoding="utf-8"?>
-<w:styles xmlns:mc="http://schemas.openxmlformats.org/markup-compatibility/2006" xmlns:r="http://schemas.openxmlformats.org/officeDocument/2006/relationships" xmlns:w="http://schemas.openxmlformats.org/wordprocessingml/2006/main" xmlns:w14="http://schemas.microsoft.com/office/word/2010/wordml" xmlns:w15="http://schemas.microsoft.com/office/word/2012/wordml" xmlns:w16se="http://schemas.microsoft.com/office/word/2015/wordml/symex" mc:Ignorable="w14 w15 w16se">
+<w:styles xmlns:mc="http://schemas.openxmlformats.org/markup-compatibility/2006" xmlns:r="http://schemas.openxmlformats.org/officeDocument/2006/relationships" xmlns:w="http://schemas.openxmlformats.org/wordprocessingml/2006/main" xmlns:w14="http://schemas.microsoft.com/office/word/2010/wordml" xmlns:w15="http://schemas.microsoft.com/office/word/2012/wordml" xmlns:w16cex="http://schemas.microsoft.com/office/word/2018/wordml/cex" xmlns:w16cid="http://schemas.microsoft.com/office/word/2016/wordml/cid" xmlns:w16="http://schemas.microsoft.com/office/word/2018/wordml" xmlns:w16sdtdh="http://schemas.microsoft.com/office/word/2020/wordml/sdtdatahash" xmlns:w16se="http://schemas.microsoft.com/office/word/2015/wordml/symex" mc:Ignorable="w14 w15 w16se w16cid w16 w16cex w16sdtdh">
   <w:docDefaults>
     <w:rPrDefault>
       <w:rPr>
@@ -3432,7 +3447,7 @@
       </w:pPr>
     </w:pPrDefault>
   </w:docDefaults>
-  <w:latentStyles w:defLockedState="0" w:defUIPriority="99" w:defSemiHidden="0" w:defUnhideWhenUsed="0" w:defQFormat="0" w:count="371">
+  <w:latentStyles w:defLockedState="0" w:defUIPriority="99" w:defSemiHidden="0" w:defUnhideWhenUsed="0" w:defQFormat="0" w:count="376">
     <w:lsdException w:name="Normal" w:uiPriority="0" w:qFormat="1"/>
     <w:lsdException w:name="heading 1" w:uiPriority="9" w:qFormat="1"/>
     <w:lsdException w:name="heading 2" w:semiHidden="1" w:uiPriority="9" w:unhideWhenUsed="1" w:qFormat="1"/>
@@ -3804,6 +3819,11 @@
     <w:lsdException w:name="List Table 5 Dark Accent 6" w:uiPriority="50"/>
     <w:lsdException w:name="List Table 6 Colorful Accent 6" w:uiPriority="51"/>
     <w:lsdException w:name="List Table 7 Colorful Accent 6" w:uiPriority="52"/>
+    <w:lsdException w:name="Mention" w:semiHidden="1" w:unhideWhenUsed="1"/>
+    <w:lsdException w:name="Smart Hyperlink" w:semiHidden="1" w:unhideWhenUsed="1"/>
+    <w:lsdException w:name="Hashtag" w:semiHidden="1" w:unhideWhenUsed="1"/>
+    <w:lsdException w:name="Unresolved Mention" w:semiHidden="1" w:unhideWhenUsed="1"/>
+    <w:lsdException w:name="Smart Link" w:semiHidden="1" w:unhideWhenUsed="1"/>
   </w:latentStyles>
   <w:style w:type="paragraph" w:default="1" w:styleId="Normal">
     <w:name w:val="Normal"/>

</xml_diff>